<commit_message>
Finalize thesis edits, add novelty/gap section, and hosting guides
- Add Section 1.8 "Research Contributions and Novelty" (3 novelties) and a
  clearer, evidence-grounded research gap in Chapter 1; renumber sections and
  fix cross-references; naturalize wording; strip stray tags
- Correct Hardware requirements to match the real single-machine setup and
  the project's own traffic generators
- Rebuild Final_Thesis (pdf/docx/odt); update interim report Chapter 1
- Add deployment guides (docs/DEPLOYMENT.md, docs/DEPLOYMENT_AWS.md) and
  scripts (vps_setup.sh, cerberus.service, start_public_demo.sh)

Co-Authored-By: Claude Opus 4.8 <noreply@anthropic.com>
</commit_message>
<xml_diff>
--- a/docs/final_thesis/Final_Thesis.docx
+++ b/docs/final_thesis/Final_Thesis.docx
@@ -115,7 +115,7 @@
       </w:pPr>
       <w:r>
         <w:rPr/>
-        <w:t xml:space="preserve">Finally, I want to thank my family and friends, who put up with a great deal of talk about kernels, packets, and thresholds over the past two months, and who kept me steady on the days the eBPF verifier did not. This dissertation would not exist without their patience and support. </w:t>
+        <w:t>Finally, I want to thank my family and friends, who put up with a great deal of talk about kernels, packets, and thresholds over the past two months, and who kept me steady on the days the eBPF verifier did not. This dissertation would not exist without their patience and support.</w:t>
       </w:r>
     </w:p>
     <w:p>
@@ -166,7 +166,7 @@
       </w:pPr>
       <w:r>
         <w:rPr/>
-        <w:t xml:space="preserve">The prototype was implemented and evaluated on a live Ubuntu host. The classifier reached an overall accuracy of 0.86 when trained and tested against 702,718 real, labelled samples. In a controlled comparison, a static-threshold baseline and the adaptive two-tier design both detected a volumetric attacker in full, but the static baseline wrongly blocked all twelve simulated legitimate users during a flash-crowd scenario, while the adaptive design blocked none of them. This result supports the central claim of the dissertation: that a two-tier, adaptively-thresholded design can preserve attack detection while substantially reducing the harm a DDoS defence causes to real users during a legitimate traffic surge, addressing a dimension of the problem that existing eBPF/XDP literature does not evaluate. </w:t>
+        <w:t>The prototype was implemented and evaluated on a live Ubuntu host. The classifier reached an overall accuracy of 0.86 when trained and tested against 702,718 real, labelled samples. In a controlled comparison, a static-threshold baseline and the adaptive two-tier design both detected a volumetric attacker in full, but the static baseline wrongly blocked all twelve simulated legitimate users during a flash-crowd scenario, while the adaptive design blocked none of them. This result supports the central claim of the dissertation: that a two-tier, adaptively-thresholded design can preserve attack detection while substantially reducing the harm a DDoS defence causes to real users during a legitimate traffic surge, addressing a dimension of the problem that existing eBPF/XDP literature does not evaluate.</w:t>
       </w:r>
     </w:p>
     <w:p>
@@ -182,7 +182,7 @@
       </w:pPr>
       <w:r>
         <w:rPr/>
-        <w:t>Contents</w:t>
+        <w:t>Table of Contents</w:t>
       </w:r>
     </w:p>
     <w:p>
@@ -467,7 +467,7 @@
           <w:b w:val="false"/>
           <w:sz w:val="22"/>
         </w:rPr>
-        <w:t>1.8 Rich Picture of the Proposed Solution</w:t>
+        <w:t>1.8 Research Contributions and Novelty</w:t>
       </w:r>
     </w:p>
     <w:p>
@@ -486,7 +486,26 @@
           <w:b w:val="false"/>
           <w:sz w:val="22"/>
         </w:rPr>
-        <w:t>1.9 Resource Requirements</w:t>
+        <w:t>1.9 Rich Picture of the Proposed Solution</w:t>
+      </w:r>
+    </w:p>
+    <w:p>
+      <w:pPr>
+        <w:pStyle w:val="BodyText"/>
+        <w:bidi w:val="0"/>
+        <w:spacing w:before="30" w:after="120"/>
+        <w:ind w:hanging="0" w:left="330" w:right="0"/>
+        <w:rPr>
+          <w:b w:val="false"/>
+          <w:sz w:val="22"/>
+        </w:rPr>
+      </w:pPr>
+      <w:r>
+        <w:rPr>
+          <w:b w:val="false"/>
+          <w:sz w:val="22"/>
+        </w:rPr>
+        <w:t>1.10 Resource Requirements</w:t>
       </w:r>
     </w:p>
     <w:p>
@@ -505,7 +524,7 @@
           <w:b w:val="false"/>
           <w:sz w:val="21"/>
         </w:rPr>
-        <w:t>1.9.1 Hardware</w:t>
+        <w:t>1.10.1 Hardware</w:t>
       </w:r>
     </w:p>
     <w:p>
@@ -524,7 +543,7 @@
           <w:b w:val="false"/>
           <w:sz w:val="21"/>
         </w:rPr>
-        <w:t>1.9.2 Software</w:t>
+        <w:t>1.10.2 Software</w:t>
       </w:r>
     </w:p>
     <w:p>
@@ -543,7 +562,7 @@
           <w:b w:val="false"/>
           <w:sz w:val="22"/>
         </w:rPr>
-        <w:t>1.10 Project Scope</w:t>
+        <w:t>1.11 Project Scope</w:t>
       </w:r>
     </w:p>
     <w:p>
@@ -562,7 +581,7 @@
           <w:b w:val="false"/>
           <w:sz w:val="22"/>
         </w:rPr>
-        <w:t>1.11 Chapter Summary</w:t>
+        <w:t>1.12 Chapter Summary</w:t>
       </w:r>
     </w:p>
     <w:p>
@@ -1792,7 +1811,7 @@
       </w:pPr>
       <w:r>
         <w:rPr/>
-        <w:t>This chapter sets out the research carried out on kernel-level DDoS detection using eBPF and XDP. It gives the background that motivates the study, states the problem in general and specific terms, and identifies the research question along with the motivation, aim, and objectives that guide the rest of the work. The chapter also sketches the proposed solution, lists the resources it needs, and marks out the boundary of what the project does and does not attempt.</w:t>
+        <w:t>This chapter sets out the research carried out on kernel-level DDoS detection using eBPF and XDP. It gives the background that motivates the study, states the problem in general and specific terms, and identifies the research question along with the motivation, aim, and objectives that guide the rest of the work. It then states the three contributions that together make up the novelty of this dissertation, before sketching the proposed solution, listing the resources it needs, and marking out the boundary of what the project does and does not attempt.</w:t>
       </w:r>
     </w:p>
     <w:p>
@@ -1892,7 +1911,7 @@
       </w:pPr>
       <w:r>
         <w:rPr/>
-        <w:t>In essence, this paradox forces organisations to choose between speed and intelligence. Static, threshold-based filters compiled into XDP - for example, dropping any source IP whose packet rate crosses a fixed number - are cheap enough to run on every packet, but cannot tell a real traffic surge (a flash sale, a viral post, a major sporting result) from an attack, since both produce the same sudden spike against the same fixed number. On the other hand, anything that needs the model itself to change, which in turn requires an update to the eBPF program, is disruptive to carry out while the system is actively defending live traffic; decision trees and quantised neural networks can be trained to recognise far more nuanced attack patterns, but only offline, before the program is loaded. Either way, the defence ends up acting too simply or too slowly for the pace of real traffic and real attackers.</w:t>
+        <w:t>This paradox forces organisations to choose between speed and intelligence. Static, threshold-based filters compiled into XDP - for example, dropping any source IP whose packet rate crosses a fixed number - are cheap enough to run on every packet, but cannot tell a real traffic surge (a flash sale, a viral post, a major sporting result) from an attack, since both produce the same sudden spike against the same fixed number. On the other hand, anything that needs the model itself to change, which in turn requires an update to the eBPF program, is disruptive to carry out while the system is actively defending live traffic; decision trees and quantised neural networks can be trained to recognise far more nuanced attack patterns, but only offline, before the program is loaded. Either way, the defence ends up acting too simply or too slowly for the pace of real traffic and real attackers.</w:t>
       </w:r>
     </w:p>
     <w:p>
@@ -1934,7 +1953,7 @@
       </w:pPr>
       <w:r>
         <w:rPr/>
-        <w:t>None of these features is individually well supported by published work, and the combination of all three appears nowhere: (a) a lightweight, two-tier detection pipeline in which only ambiguous traffic is escalated from a cheap statistical pre-filter to a small machine-learning classifier; (b) an online mechanism by which a userspace control loop can adjust the escalation threshold that governs when traffic reaches that classifier, without recompiling or reloading the XDP program; and (c) an evaluation methodology that explicitly measures false positives against legitimate flash-crowd traffic, rather than against attack traffic alone. The gap this dissertation targets in the research literature is that combination.</w:t>
+        <w:t>Looked at one at a time, the studies above each cover at most one of these three ideas, and even then only in part. Abranches et al. show that a cheap in-kernel filter can hand the harder work to a more expensive check, but they do this for general network monitoring, not for DDoS detection. None of the DDoS-specific systems reviewed - Anand et al., Hara and Sasabe, Farasat et al., or Zheng and Zhang - pick that idea up; each runs its classifier over all traffic rather than saving it for the sources the first tier cannot already sort out. On the second idea, adaptivity, Elzoghbi and He come closest, because they recalculate their threshold while the system runs. But that threshold is a statistical recalculation, not the escalation boundary of a learned model, and their design needs an SDN controller and OpenFlow switches instead of a plain Linux host. Hara and Sasabe, for their part, describe a choice made at design time between running the classifier in the kernel or in userspace, not a decision the system makes for itself while it is running. The third idea, the evaluation method, is where the gap is clearest. Tolay openly leaves the question of false positives unanswered, the cloud and container systems report no flash-crowd test at all, and even the highest accuracy figures in the reviewed papers - Anand et al.'s 99.44 percent, Farasat et al.'s filtering of 2.2 million packets in live testing - come only from labelled attack data, never from a legitimate surge generated on purpose. So parts of the problem have been solved on their own, but no single paper reviewed here puts all three together: a two-tier pipeline that escalates only ambiguous traffic, a threshold that can be changed at runtime without reloading the XDP program, and an evaluation that measures false positives against a legitimate flash crowd rather than against attack traffic alone. That combination is what this dissertation sets out to build and test.</w:t>
       </w:r>
     </w:p>
     <w:p>
@@ -2195,7 +2214,106 @@
       </w:pPr>
       <w:r>
         <w:rPr/>
-        <w:t>1.8 Rich Picture of the Proposed Solution</w:t>
+        <w:t>1.8 Research Contributions and Novelty</w:t>
+      </w:r>
+    </w:p>
+    <w:p>
+      <w:pPr>
+        <w:pStyle w:val="BodyText"/>
+        <w:bidi w:val="0"/>
+        <w:spacing w:before="120" w:after="120"/>
+        <w:ind w:left="120" w:right="120"/>
+        <w:rPr/>
+      </w:pPr>
+      <w:r>
+        <w:rPr/>
+        <w:t>As Section 1.3.2 explained, the gap is not that any single one of these ideas is missing from the literature. It is that no system brings all three together. This dissertation makes three contributions, and its novelty is in combining them in one system that runs on an ordinary Linux host.</w:t>
+      </w:r>
+    </w:p>
+    <w:p>
+      <w:pPr>
+        <w:pStyle w:val="BodyText"/>
+        <w:bidi w:val="0"/>
+        <w:spacing w:before="120" w:after="120"/>
+        <w:ind w:left="120" w:right="120"/>
+        <w:rPr/>
+      </w:pPr>
+      <w:r>
+        <w:rPr>
+          <w:rStyle w:val="Strong"/>
+        </w:rPr>
+        <w:t>Contribution 1 - An adaptive detection threshold that is updated live, without reloading the XDP program.</w:t>
+      </w:r>
+      <w:r>
+        <w:rPr/>
+        <w:t xml:space="preserve"> A userspace control loop keeps track of the recent traffic rate and writes an updated threshold into a shared BPF map. The kernel program reads that value on the next packet it handles. Because the threshold sits in a map instead of being compiled into the program, it can be changed while the system is still running and still filtering traffic, with no recompilation and no reload of the XDP hook. This is the thing the static systems in Chapter Two cannot do, since their threshold is fixed once the program is loaded. The closest existing work, by Elzoghbi and He, does adjust its threshold while running, but it needs an SDN controller and OpenFlow switches to do so; the system here needs neither.</w:t>
+      </w:r>
+    </w:p>
+    <w:p>
+      <w:pPr>
+        <w:pStyle w:val="BodyText"/>
+        <w:bidi w:val="0"/>
+        <w:spacing w:before="120" w:after="120"/>
+        <w:ind w:left="120" w:right="120"/>
+        <w:rPr/>
+      </w:pPr>
+      <w:r>
+        <w:rPr>
+          <w:rStyle w:val="Strong"/>
+        </w:rPr>
+        <w:t>Contribution 2 - A two-tier pipeline that escalates only ambiguous traffic to a machine-learning classifier.</w:t>
+      </w:r>
+      <w:r>
+        <w:rPr/>
+        <w:t xml:space="preserve"> The cheap statistical filter at the XDP hook runs on every packet. The decision-tree classifier does not. It is called only for the small group of sources that the first tier cannot clearly label as either normal or hostile. This keeps the heavier classification work off the per-packet path, and spends it only where it might change the outcome. None of the DDoS-specific systems reviewed in Chapter Two use their classifier this way; each one runs its model over all traffic instead.</w:t>
+      </w:r>
+    </w:p>
+    <w:p>
+      <w:pPr>
+        <w:pStyle w:val="BodyText"/>
+        <w:bidi w:val="0"/>
+        <w:spacing w:before="120" w:after="120"/>
+        <w:ind w:left="120" w:right="120"/>
+        <w:rPr/>
+      </w:pPr>
+      <w:r>
+        <w:rPr>
+          <w:rStyle w:val="Strong"/>
+        </w:rPr>
+        <w:t>Contribution 3 - An evaluation that measures false positives against legitimate flash-crowd traffic, not against attack traffic alone.</w:t>
+      </w:r>
+      <w:r>
+        <w:rPr/>
+        <w:t xml:space="preserve"> As well as generating synthetic attack traffic, the evaluation generates a sudden burst of legitimate traffic - a flash crowd - and counts how many real users the system wrongly blocks under a fixed threshold compared with the adaptive one. This is the weakness that shows up most often in the reviewed work, where even the systems with the highest reported accuracy are only ever tested against labelled attack data. It is also the part of the evaluation that the main claim of this dissertation depends on, and it is set out in full in Chapter Six.</w:t>
+      </w:r>
+    </w:p>
+    <w:p>
+      <w:pPr>
+        <w:pStyle w:val="BodyText"/>
+        <w:bidi w:val="0"/>
+        <w:spacing w:before="120" w:after="120"/>
+        <w:ind w:left="120" w:right="120"/>
+        <w:rPr/>
+      </w:pPr>
+      <w:r>
+        <w:rPr/>
+        <w:t>The three contributions are not separate features bolted together. The selective two-tier design (Contribution 2) is what makes it affordable to run a machine-learning tier on the host at all. The live threshold (Contribution 1) is what lets that pipeline adjust itself while it runs, instead of being tuned once and then left alone. The flash-crowd evaluation (Contribution 3) is what shows the adaptivity actually improves the balance between blocking attackers and letting real users through, rather than just moving the problem somewhere else.</w:t>
+      </w:r>
+    </w:p>
+    <w:p>
+      <w:pPr>
+        <w:pStyle w:val="Heading2"/>
+        <w:numPr>
+          <w:ilvl w:val="0"/>
+          <w:numId w:val="0"/>
+        </w:numPr>
+        <w:bidi w:val="0"/>
+        <w:spacing w:before="300" w:after="120"/>
+        <w:rPr/>
+      </w:pPr>
+      <w:r>
+        <w:rPr/>
+        <w:t>1.9 Rich Picture of the Proposed Solution</w:t>
       </w:r>
     </w:p>
     <w:p>
@@ -2341,7 +2459,7 @@
       </w:pPr>
       <w:r>
         <w:rPr/>
-        <w:t>1.9 Resource Requirements</w:t>
+        <w:t>1.10 Resource Requirements</w:t>
       </w:r>
     </w:p>
     <w:p>
@@ -2357,7 +2475,7 @@
       </w:pPr>
       <w:r>
         <w:rPr/>
-        <w:t>1.9.1 Hardware</w:t>
+        <w:t>1.10.1 Hardware</w:t>
       </w:r>
     </w:p>
     <w:p>
@@ -2378,7 +2496,7 @@
       </w:pPr>
       <w:r>
         <w:rPr/>
-        <w:t xml:space="preserve">A Linux test server, either a physical machine or a cloud VM with kernel-level access, running a minimum kernel version of 5.10 for stable support of the required BPF map types and XDP hooks. </w:t>
+        <w:t xml:space="preserve">A Linux host with kernel-level access, either a physical machine or a virtual machine, running a kernel of at least version 5.10 so that the BPF map types and XDP hooks the system depends on are stably supported. The prototype was developed and tested on a host running kernel version 7.0.0. </w:t>
       </w:r>
     </w:p>
     <w:p>
@@ -2399,7 +2517,7 @@
       </w:pPr>
       <w:r>
         <w:rPr/>
-        <w:t xml:space="preserve">A second machine, or a separate set of cloud instances, to act as the traffic generator for attack and flash-crowd test traffic, kept physically or logically separate from the system under test so that the generator's own CPU load does not contaminate the measurements taken on the host being defended. </w:t>
+        <w:t xml:space="preserve">A source of test traffic. The project supplies its own generator scripts for this - attack_gen.py for attack traffic and flashcrowd_gen.py for legitimate flash-crowd traffic </w:t>
       </w:r>
     </w:p>
     <w:p>
@@ -2414,12 +2532,33 @@
           <w:tab w:val="left" w:pos="829" w:leader="none"/>
         </w:tabs>
         <w:bidi w:val="0"/>
+        <w:spacing w:before="120" w:after="0"/>
         <w:ind w:hanging="283" w:left="829"/>
         <w:rPr/>
       </w:pPr>
       <w:r>
         <w:rPr/>
-        <w:t xml:space="preserve">Where available, a network interface card known to support native XDP mode rather than the slower generic/SKB mode, for accurate throughput figures. </w:t>
+        <w:t xml:space="preserve">so that no separate commercial tool is needed. Running these generators on a second machine, kept separate from the host being defended, is the recommended setup where one is available, so that the generator's own CPU load does not affect the measurements taken on the host. The evaluation in Chapter Six was run on a single host, which is noted there as a limitation of the test setup. </w:t>
+      </w:r>
+    </w:p>
+    <w:p>
+      <w:pPr>
+        <w:pStyle w:val="BodyText"/>
+        <w:numPr>
+          <w:ilvl w:val="0"/>
+          <w:numId w:val="2"/>
+        </w:numPr>
+        <w:tabs>
+          <w:tab w:val="clear" w:pos="1134"/>
+          <w:tab w:val="left" w:pos="829" w:leader="none"/>
+        </w:tabs>
+        <w:bidi w:val="0"/>
+        <w:ind w:hanging="283" w:left="829"/>
+        <w:rPr/>
+      </w:pPr>
+      <w:r>
+        <w:rPr/>
+        <w:t xml:space="preserve">Where available, a network interface card that supports native XDP mode rather than the slower generic/SKB fallback, for more accurate throughput figures. </w:t>
       </w:r>
     </w:p>
     <w:p>
@@ -2435,7 +2574,7 @@
       </w:pPr>
       <w:r>
         <w:rPr/>
-        <w:t>1.9.2 Software</w:t>
+        <w:t>1.10.2 Software</w:t>
       </w:r>
     </w:p>
     <w:p>
@@ -2576,7 +2715,7 @@
       </w:pPr>
       <w:r>
         <w:rPr/>
-        <w:t>1.10 Project Scope</w:t>
+        <w:t>1.11 Project Scope</w:t>
       </w:r>
     </w:p>
     <w:p>
@@ -2767,7 +2906,7 @@
       </w:pPr>
       <w:r>
         <w:rPr/>
-        <w:t>1.11 Chapter Summary</w:t>
+        <w:t>1.12 Chapter Summary</w:t>
       </w:r>
     </w:p>
     <w:p>
@@ -2780,7 +2919,7 @@
       </w:pPr>
       <w:r>
         <w:rPr/>
-        <w:t xml:space="preserve">This chapter placed the dissertation in the context of the rapid growth in the volume and sophistication of DDoS attacks, and used that context to motivate a precise problem statement: existing eBPF/XDP detection systems are either fast but static, or accurate but frozen once deployed, and none of the reviewed literature tests how these systems behave when faced with a legitimate traffic surge. A single research question, a supporting aim, and four research-specific objectives were drawn from this problem statement, alongside a description of the proposed two-tier, online-adaptive solution, the resources it requires, and a clear boundary of what the project will and will not attempt. Chapter Two now turns to a detailed review of the literature that this problem statement is built on. </w:t>
+        <w:t>This chapter placed the dissertation in the context of the rapid growth in the volume and sophistication of DDoS attacks, and used that context to motivate a precise problem statement: existing eBPF/XDP detection systems are either fast but static, or accurate but frozen once deployed, and none of the reviewed literature tests how these systems behave when faced with a legitimate traffic surge. A single research question, a supporting aim, and four research-specific objectives were drawn from this problem statement, and the three contributions that together make up the novelty of this work - the live-updatable threshold, the selective two-tier pipeline, and the flash-crowd false-positive evaluation - were stated explicitly, alongside a description of the proposed two-tier, online-adaptive solution, the resources it requires, and a clear boundary of what the project will and will not attempt. Chapter Two now turns to a detailed review of the literature that this problem statement is built on.</w:t>
       </w:r>
     </w:p>
     <w:p>
@@ -3250,7 +3389,7 @@
       </w:pPr>
       <w:r>
         <w:rPr/>
-        <w:t>Moving to machine-learning-augmented systems, Anand et al. integrate eBPF with four classic classifiers - Decision Tree, Random Forest, Support Vector Machine, and TwinSVM - trained on the CIC-IDS-2017 dataset, with the Random Forest classifier reaching the highest accuracy at 99.44 percent. This is a strong accuracy figure and is treated here as a reasonable baseline for the offline-training side of the proposed prototype, though integrating the classifier with XDP for lower-latency processing is left as future work in the paper itself, and, like the systems above, the evaluation is carried out only against labelled attack data. Hara and Sasabe take this a step further, showing that a quantised integer-arithmetic neural network and a decision-tree classifier can both be compiled to run within the constraints the eBPF/XDP verifier imposes, using BPF tail calls to work around the instruction-count limit - a significant piece of engineering in its own right, and one that speaks to the design choices made in this dissertation's own prototype, discussed further in Section 1.8. The trade-off they describe, however, is not something that can be changed at runtime; it is a design-time choice between an in-kernel approach and an AF_XDP-offloaded userspace approach, not a live decision the system makes for itself.</w:t>
+        <w:t>Moving to machine-learning-augmented systems, Anand et al. integrate eBPF with four classic classifiers - Decision Tree, Random Forest, Support Vector Machine, and TwinSVM - trained on the CIC-IDS-2017 dataset, with the Random Forest classifier reaching the highest accuracy at 99.44 percent. This is a strong accuracy figure and is treated here as a reasonable baseline for the offline-training side of the proposed prototype, though integrating the classifier with XDP for lower-latency processing is left as future work in the paper itself, and, like the systems above, the evaluation is carried out only against labelled attack data. Hara and Sasabe take this a step further, showing that a quantised integer-arithmetic neural network and a decision-tree classifier can both be compiled to run within the constraints the eBPF/XDP verifier imposes, using BPF tail calls to work around the instruction-count limit - a significant piece of engineering in its own right, and one that speaks to the design choices made in this dissertation's own prototype, discussed further in Section 1.9. The trade-off they describe, however, is not something that can be changed at runtime; it is a design-time choice between an in-kernel approach and an AF_XDP-offloaded userspace approach, not a live decision the system makes for itself.</w:t>
       </w:r>
     </w:p>
     <w:p>
@@ -3363,7 +3502,7 @@
       </w:pPr>
       <w:r>
         <w:rPr/>
-        <w:t>Architecturally, the systems reviewed differ along three dimensions. The first is single-tier versus multi-tier processing: most of the reviewed systems apply one mechanism, either a threshold or a classifier, uniformly to all traffic, with Abranches et al., outside the DDoS-specific context, and to a lesser extent Farasat et al., splitting a cheaper always-on stage from a more expensive stage that is invoked selectively. The second dimension is host-level versus controller-dependent deployment: Elzoghbi and He's SDN/OpenFlow architecture trades the visibility a centralised controller offers against the added complexity of deploying one, while the remaining architectures, including the one proposed here, operate independently on a single host, or, in the Kubernetes case, a single node. The third dimension, and the one most relevant to this dissertation, is static versus adaptive parameterisation: every system reviewed here hard-codes its thresholds and model weights at compile time, with the exception of Elzoghbi and He, who recalculate a purely statistical threshold; none of them combine a learned classifier with an update mechanism that runs in userspace and pushes changes back through BPF maps. This third dimension is exactly where the research gap sits, and it feeds straight into the userspace control-loop design described in Section 1.8.</w:t>
+        <w:t>Architecturally, the systems reviewed differ along three dimensions. The first is single-tier versus multi-tier processing: most of the reviewed systems apply one mechanism, either a threshold or a classifier, uniformly to all traffic, with Abranches et al., outside the DDoS-specific context, and to a lesser extent Farasat et al., splitting a cheaper always-on stage from a more expensive stage that is invoked selectively. The second dimension is host-level versus controller-dependent deployment: Elzoghbi and He's SDN/OpenFlow architecture trades the visibility a centralised controller offers against the added complexity of deploying one, while the remaining architectures, including the one proposed here, operate independently on a single host, or, in the Kubernetes case, a single node. The third dimension, and the one most relevant to this dissertation, is static versus adaptive parameterisation: every system reviewed here hard-codes its thresholds and model weights at compile time, with the exception of Elzoghbi and He, who recalculate a purely statistical threshold; none of them combine a learned classifier with an update mechanism that runs in userspace and pushes changes back through BPF maps. This third dimension is exactly where the research gap sits, and it feeds straight into the userspace control-loop design described in Section 1.9.</w:t>
       </w:r>
     </w:p>
     <w:p>
@@ -3392,7 +3531,7 @@
       </w:pPr>
       <w:r>
         <w:rPr/>
-        <w:t xml:space="preserve">The literature reviewed here is concentrated mostly within the last two years, which reflects how actively the eBPF/XDP subsystem is still developing - a paper from several years earlier, even where the underlying idea has not aged badly, would likely be out of step with what the current verifier actually allows. Reading across this recent literature, the pattern flagged in Chapter One holds up under scrutiny: systems are either fast and static, accurate but frozen once deployed, or adaptive only in a purely statistical and controller-dependent sense. None of the sources reviewed combine a learned, selectively-invoked classifier with a live, host-level, BPF-map-driven update mechanism, and none of them measure false positives against a deliberately generated traffic surge. This chapter therefore confirms, with the support of the literature reviewed here, the research gap set out in Section 1.3.2, and the methodology proposed in Chapter Three is aimed squarely at closing it. </w:t>
+        <w:t>The literature reviewed here is concentrated mostly within the last two years, which reflects how actively the eBPF/XDP subsystem is still developing - a paper from several years earlier, even where the underlying idea has not aged badly, would likely be out of step with what the current verifier actually allows. Reading across this recent literature, the pattern flagged in Chapter One holds up under scrutiny: systems are either fast and static, accurate but frozen once deployed, or adaptive only in a purely statistical and controller-dependent sense. None of the sources reviewed combine a learned, selectively-invoked classifier with a live, host-level, BPF-map-driven update mechanism, and none of them measure false positives against a deliberately generated traffic surge. This chapter therefore confirms, with the support of the literature reviewed here, the research gap set out in Section 1.3.2, and the methodology proposed in Chapter Three is aimed squarely at closing it.</w:t>
       </w:r>
     </w:p>
     <w:p>
@@ -3552,8 +3691,8 @@
         </w:tblCellMar>
       </w:tblPr>
       <w:tblGrid>
-        <w:gridCol w:w="2563"/>
-        <w:gridCol w:w="6849"/>
+        <w:gridCol w:w="2559"/>
+        <w:gridCol w:w="6853"/>
       </w:tblGrid>
       <w:tr>
         <w:trPr>
@@ -3561,7 +3700,7 @@
         </w:trPr>
         <w:tc>
           <w:tcPr>
-            <w:tcW w:w="2563" w:type="dxa"/>
+            <w:tcW w:w="2559" w:type="dxa"/>
             <w:tcBorders/>
             <w:vAlign w:val="center"/>
           </w:tcPr>
@@ -3582,7 +3721,7 @@
         </w:tc>
         <w:tc>
           <w:tcPr>
-            <w:tcW w:w="6849" w:type="dxa"/>
+            <w:tcW w:w="6853" w:type="dxa"/>
             <w:tcBorders/>
             <w:vAlign w:val="center"/>
           </w:tcPr>
@@ -3606,7 +3745,7 @@
         <w:trPr/>
         <w:tc>
           <w:tcPr>
-            <w:tcW w:w="2563" w:type="dxa"/>
+            <w:tcW w:w="2559" w:type="dxa"/>
             <w:tcBorders/>
             <w:vAlign w:val="center"/>
           </w:tcPr>
@@ -3626,7 +3765,7 @@
         </w:tc>
         <w:tc>
           <w:tcPr>
-            <w:tcW w:w="6849" w:type="dxa"/>
+            <w:tcW w:w="6853" w:type="dxa"/>
             <w:tcBorders/>
             <w:vAlign w:val="center"/>
           </w:tcPr>
@@ -3649,7 +3788,7 @@
         <w:trPr/>
         <w:tc>
           <w:tcPr>
-            <w:tcW w:w="2563" w:type="dxa"/>
+            <w:tcW w:w="2559" w:type="dxa"/>
             <w:tcBorders/>
             <w:vAlign w:val="center"/>
           </w:tcPr>
@@ -3669,7 +3808,7 @@
         </w:tc>
         <w:tc>
           <w:tcPr>
-            <w:tcW w:w="6849" w:type="dxa"/>
+            <w:tcW w:w="6853" w:type="dxa"/>
             <w:tcBorders/>
             <w:vAlign w:val="center"/>
           </w:tcPr>
@@ -3692,7 +3831,7 @@
         <w:trPr/>
         <w:tc>
           <w:tcPr>
-            <w:tcW w:w="2563" w:type="dxa"/>
+            <w:tcW w:w="2559" w:type="dxa"/>
             <w:tcBorders/>
             <w:vAlign w:val="center"/>
           </w:tcPr>
@@ -3712,7 +3851,7 @@
         </w:tc>
         <w:tc>
           <w:tcPr>
-            <w:tcW w:w="6849" w:type="dxa"/>
+            <w:tcW w:w="6853" w:type="dxa"/>
             <w:tcBorders/>
             <w:vAlign w:val="center"/>
           </w:tcPr>
@@ -3735,7 +3874,7 @@
         <w:trPr/>
         <w:tc>
           <w:tcPr>
-            <w:tcW w:w="2563" w:type="dxa"/>
+            <w:tcW w:w="2559" w:type="dxa"/>
             <w:tcBorders/>
             <w:vAlign w:val="center"/>
           </w:tcPr>
@@ -3755,7 +3894,7 @@
         </w:tc>
         <w:tc>
           <w:tcPr>
-            <w:tcW w:w="6849" w:type="dxa"/>
+            <w:tcW w:w="6853" w:type="dxa"/>
             <w:tcBorders/>
             <w:vAlign w:val="center"/>
           </w:tcPr>
@@ -3778,7 +3917,7 @@
         <w:trPr/>
         <w:tc>
           <w:tcPr>
-            <w:tcW w:w="2563" w:type="dxa"/>
+            <w:tcW w:w="2559" w:type="dxa"/>
             <w:tcBorders/>
             <w:vAlign w:val="center"/>
           </w:tcPr>
@@ -3798,21 +3937,21 @@
         </w:tc>
         <w:tc>
           <w:tcPr>
-            <w:tcW w:w="6849" w:type="dxa"/>
-            <w:tcBorders/>
-            <w:vAlign w:val="center"/>
-          </w:tcPr>
-          <w:p>
-            <w:pPr>
-              <w:pStyle w:val="TableContents"/>
-              <w:bidi w:val="0"/>
-              <w:spacing w:before="120" w:after="120"/>
-              <w:jc w:val="left"/>
-              <w:rPr/>
-            </w:pPr>
-            <w:r>
-              <w:rPr/>
-              <w:t>Addressed through the two-tier architecture and userspace control-loop design in Section 1.8, implemented using the toolchain in Section 1.9, with experimental data version-controlled alongside the source-code repository for traceability.</w:t>
+            <w:tcW w:w="6853" w:type="dxa"/>
+            <w:tcBorders/>
+            <w:vAlign w:val="center"/>
+          </w:tcPr>
+          <w:p>
+            <w:pPr>
+              <w:pStyle w:val="TableContents"/>
+              <w:bidi w:val="0"/>
+              <w:spacing w:before="120" w:after="120"/>
+              <w:jc w:val="left"/>
+              <w:rPr/>
+            </w:pPr>
+            <w:r>
+              <w:rPr/>
+              <w:t>Addressed through the two-tier architecture and userspace control-loop design in Section 1.9, implemented using the toolchain in Section 1.10, with experimental data version-controlled alongside the source-code repository for traceability.</w:t>
             </w:r>
           </w:p>
         </w:tc>
@@ -3821,7 +3960,7 @@
         <w:trPr/>
         <w:tc>
           <w:tcPr>
-            <w:tcW w:w="2563" w:type="dxa"/>
+            <w:tcW w:w="2559" w:type="dxa"/>
             <w:tcBorders/>
             <w:vAlign w:val="center"/>
           </w:tcPr>
@@ -3841,7 +3980,7 @@
         </w:tc>
         <w:tc>
           <w:tcPr>
-            <w:tcW w:w="6849" w:type="dxa"/>
+            <w:tcW w:w="6853" w:type="dxa"/>
             <w:tcBorders/>
             <w:vAlign w:val="center"/>
           </w:tcPr>
@@ -5723,7 +5862,7 @@
       </w:pPr>
       <w:r>
         <w:rPr/>
-        <w:t xml:space="preserve">This chapter turned the aim and objectives of Chapter One into a concrete specification. It set out who the system serves - the operator, the legitimate user who never sees it, the attacker, and the researcher who has to be able to demonstrate every claim made about it - and explained how the CIC-IDS-2017 dataset and the generated attack and flash-crowd traffic operationalise the research objectives in place of a questionnaire. It modelled the system through use case, class, activity, sequence, and deployment views, set out the two-tier architecture with the BPF maps as the single bridge between its halves, and closed with the functional and non-functional requirements the implementation was built to satisfy. Chapter Five now describes how that implementation was actually carried out. </w:t>
+        <w:t>This chapter turned the aim and objectives of Chapter One into a concrete specification. It set out who the system serves - the operator, the legitimate user who never sees it, the attacker, and the researcher who has to be able to demonstrate every claim made about it - and explained how the CIC-IDS-2017 dataset and the generated attack and flash-crowd traffic operationalise the research objectives in place of a questionnaire. It modelled the system through use case, class, activity, sequence, and deployment views, set out the two-tier architecture with the BPF maps as the single bridge between its halves, and closed with the functional and non-functional requirements the implementation was built to satisfy. Chapter Five now describes how that implementation was actually carried out.</w:t>
       </w:r>
     </w:p>
     <w:p>
@@ -8515,7 +8654,7 @@
       </w:pPr>
       <w:r>
         <w:rPr/>
-        <w:t xml:space="preserve">This chapter described how the two-tier design from Chapter Four was actually built. It set out the bounded per-packet filtering logic and explained why its boundedness is what allows it to run inside the kernel at all, the exponentially-smoothed adaptive control loop, and the selective-escalation rule that keeps the classifier off the packet path. It justified each technology choice against the practical constraints of the project, and it gave real evidence - a portability fix that was needed before the kernel program would even compile, live packet counts read straight from the kernel during a flood, a confirmed live threshold change, a genuine measurement pitfall that was found and worked around, and a classifier trained on 702,718 real samples - that the system does what Chapter Four specified. Chapter Six now turns to testing this system formally and evaluating it against the research question. </w:t>
+        <w:t>This chapter described how the two-tier design from Chapter Four was actually built. It set out the bounded per-packet filtering logic and explained why its boundedness is what allows it to run inside the kernel at all, the exponentially-smoothed adaptive control loop, and the selective-escalation rule that keeps the classifier off the packet path. It justified each technology choice against the practical constraints of the project, and it gave real evidence - a portability fix that was needed before the kernel program would even compile, live packet counts read straight from the kernel during a flood, a confirmed live threshold change, a genuine measurement pitfall that was found and worked around, and a classifier trained on 702,718 real samples - that the system does what Chapter Four specified. Chapter Six now turns to testing this system formally and evaluating it against the research question.</w:t>
       </w:r>
     </w:p>
     <w:p>
@@ -10406,7 +10545,7 @@
       </w:pPr>
       <w:r>
         <w:rPr/>
-        <w:t>Two limitations of the evaluation as it currently stands should be stated plainly, rather than left for an examiner to find. First, the flash-crowd scenario was run on a single host, using distinct source addresses to represent twelve separate "users" rather than twelve actually separate physical machines; a multi-host setup, with the traffic generator kept on hardware separate from the system under test as specified in Section 1.9.1, would strengthen the external validity of this result, and the architecture already supports it without any change. Second, the adaptive-configuration column above used a representative fixed value standing in for the threshold the live control loop settles on during a surge, rather than letting the control loop choose that value for itself in the middle of the run; doing so, and repeating each scenario several times to report a mean and a spread rather than a single run, would turn this result into a fuller statistical evaluation. Neither limitation changes the direction of the result reported above, but both are the natural next steps, and both are picked up again in the future work discussed in Chapter Seven.</w:t>
+        <w:t>Two limitations of the evaluation as it currently stands should be stated plainly, rather than left for an examiner to find. First, the flash-crowd scenario was run on a single host, using distinct source addresses to represent twelve separate "users" rather than twelve actually separate physical machines; a multi-host setup, with the traffic generator kept on hardware separate from the system under test as specified in Section 1.10.1, would strengthen the external validity of this result, and the architecture already supports it without any change. Second, the adaptive-configuration column above used a representative fixed value standing in for the threshold the live control loop settles on during a surge, rather than letting the control loop choose that value for itself in the middle of the run; doing so, and repeating each scenario several times to report a mean and a spread rather than a single run, would turn this result into a fuller statistical evaluation. Neither limitation changes the direction of the result reported above, but both are the natural next steps, and both are picked up again in the future work discussed in Chapter Seven.</w:t>
       </w:r>
     </w:p>
     <w:p>
@@ -10464,7 +10603,7 @@
       </w:pPr>
       <w:r>
         <w:rPr/>
-        <w:t xml:space="preserve">This chapter tested and evaluated the system built in Chapter Five. The functional tests confirmed that the program attaches, counts, drops over threshold, updates the threshold live, escalates ambiguous sources, and classifies them correctly, and that the dashboard and other interfaces reflect this behaviour accurately. The evaluation then showed that the Tier-2 classifier reaches 0.86 accuracy on real CIC-IDS-2017 data, that a sustained flood of over 1.8 million packets was correctly filtered while unrelated traffic passed untouched, and, most importantly, that against a legitimate flash crowd the adaptive design blocked none of twelve legitimate sources where a static threshold blocked all twelve, with both catching the attacker. The limitations of the current single-host setup were stated openly. Chapter Seven now reflects on these results against the objectives set out in Chapter One and considers where the work goes from here. </w:t>
+        <w:t>This chapter tested and evaluated the system built in Chapter Five. The functional tests confirmed that the program attaches, counts, drops over threshold, updates the threshold live, escalates ambiguous sources, and classifies them correctly, and that the dashboard and other interfaces reflect this behaviour accurately. The evaluation then showed that the Tier-2 classifier reaches 0.86 accuracy on real CIC-IDS-2017 data, that a sustained flood of over 1.8 million packets was correctly filtered while unrelated traffic passed untouched, and, most importantly, that against a legitimate flash crowd the adaptive design blocked none of twelve legitimate sources where a static threshold blocked all twelve, with both catching the attacker. The limitations of the current single-host setup were stated openly. Chapter Seven now reflects on these results against the objectives set out in Chapter One and considers where the work goes from here.</w:t>
       </w:r>
     </w:p>
     <w:p>
@@ -10530,7 +10669,7 @@
       </w:pPr>
       <w:r>
         <w:rPr/>
-        <w:t>Taken together, and triangulating three independent strands of evidence - the functional tests confirming the mechanism works, the 0.86 accuracy of the classifier on a real benchmark dataset, and the flash-crowd comparison itself - the research question posed in Chapter One can be answered with a qualified yes: this design does maintain attack detection while measurably reducing flash-crowd false positives relative to a static baseline, at least under the conditions tested so far, with the honestly-stated limitations set out in Section 6.5.</w:t>
+        <w:t>Putting the three independent strands of evidence side by side - the functional tests confirming the mechanism works, the 0.86 accuracy of the classifier on a real benchmark dataset, and the flash-crowd comparison itself - the research question posed in Chapter One can be answered with a qualified yes: this design does maintain attack detection while measurably reducing flash-crowd false positives relative to a static baseline, at least under the conditions tested so far, with the honestly-stated limitations set out in Section 6.5.</w:t>
       </w:r>
     </w:p>
     <w:p>
@@ -10775,7 +10914,7 @@
       </w:pPr>
       <w:r>
         <w:rPr/>
-        <w:t xml:space="preserve">Several concrete extensions follow naturally from the limitations acknowledged above. Retraining the classifier on features that can actually be measured at inference time, rather than on the richer offline dataset features it currently learns from, would close the gap between the reported 0.86 accuracy and the classifier's real behaviour in production, and is the most important of these. Repeating the flash-crowd evaluation across truly separate physical machines, with the adaptive control loop choosing its own threshold during the run rather than a fixed stand-in value, and running each scenario several times to report a mean and a spread, would turn the current demonstration into a fuller statistical result. Extending the comparison to include at least one previously published method as a second baseline, rather than only a static threshold, would allow the system to be positioned quantitatively against the state of the art rather than only against a strawman. Beyond these, supporting IPv6 traffic and examining application-layer surges, both explicitly out of scope in Chapter One, would broaden the system considerably. Taken together, these steps mark a realistic path from a working, evidenced prototype towards a result solid enough to submit for peer review. </w:t>
+        <w:t>Several concrete extensions follow naturally from the limitations acknowledged above. Retraining the classifier on features that can actually be measured at inference time, rather than on the richer offline dataset features it currently learns from, would close the gap between the reported 0.86 accuracy and the classifier's real behaviour in production, and is the most important of these. Repeating the flash-crowd evaluation across truly separate physical machines, with the adaptive control loop choosing its own threshold during the run rather than a fixed stand-in value, and running each scenario several times to report a mean and a spread, would turn the current demonstration into a fuller statistical result. Extending the comparison to include at least one previously published method as a second baseline, rather than only a static threshold, would allow the system to be positioned quantitatively against the state of the art rather than only against a strawman. Beyond these, supporting IPv6 traffic and examining application-layer surges, both explicitly out of scope in Chapter One, would broaden the system considerably. Between them, these steps mark a realistic path from a working, evidenced prototype towards a result solid enough to submit for peer review.</w:t>
       </w:r>
     </w:p>
     <w:p>
@@ -11051,7 +11190,7 @@
       </w:pPr>
       <w:r>
         <w:rPr/>
-        <w:t xml:space="preserve">T. Farasat, J. Kim, and J. Posegga, "SmartX Intelligent Sec: A Security Framework Based on Machine Learning and eBPF/XDP," arXiv:2410.20244, 2024. </w:t>
+        <w:t>T. Farasat, J. Kim, and J. Posegga, "SmartX Intelligent Sec: A Security Framework Based on Machine Learning and eBPF/XDP," arXiv:2410.20244, 2024.</w:t>
       </w:r>
     </w:p>
     <w:p>
@@ -14236,59 +14375,6 @@
             <w:r>
               <w:rPr/>
               <w:t>The dashboard reflects the resulting rise in seen and dropped packets, and the attacking source appears in the top-sources list marked as dropped</w:t>
-            </w:r>
-          </w:p>
-        </w:tc>
-      </w:tr>
-      <w:tr>
-        <w:trPr/>
-        <w:tc>
-          <w:tcPr>
-            <w:tcW w:w="1561" w:type="dxa"/>
-            <w:tcBorders/>
-            <w:vAlign w:val="center"/>
-          </w:tcPr>
-          <w:p>
-            <w:pPr>
-              <w:pStyle w:val="TableContents"/>
-              <w:bidi w:val="0"/>
-              <w:spacing w:before="120" w:after="120"/>
-              <w:jc w:val="left"/>
-              <w:rPr>
-                <w:sz w:val="4"/>
-                <w:szCs w:val="4"/>
-              </w:rPr>
-            </w:pPr>
-            <w:r>
-              <w:rPr>
-                <w:sz w:val="4"/>
-                <w:szCs w:val="4"/>
-              </w:rPr>
-            </w:r>
-          </w:p>
-        </w:tc>
-        <w:tc>
-          <w:tcPr>
-            <w:tcW w:w="7851" w:type="dxa"/>
-            <w:tcBorders/>
-            <w:vAlign w:val="center"/>
-          </w:tcPr>
-          <w:p>
-            <w:pPr>
-              <w:pStyle w:val="TableContents"/>
-              <w:bidi w:val="0"/>
-              <w:spacing w:before="120" w:after="120"/>
-              <w:jc w:val="left"/>
-              <w:rPr>
-                <w:sz w:val="4"/>
-                <w:szCs w:val="4"/>
-              </w:rPr>
-            </w:pPr>
-            <w:r>
-              <w:rPr>
-                <w:sz w:val="4"/>
-                <w:szCs w:val="4"/>
-              </w:rPr>
             </w:r>
           </w:p>
         </w:tc>
@@ -15247,19 +15333,19 @@
       <w:szCs w:val="21"/>
     </w:rPr>
   </w:style>
-  <w:style w:type="character" w:styleId="Bullets">
-    <w:name w:val="Bullets"/>
-    <w:qFormat/>
-    <w:rPr>
-      <w:rFonts w:ascii="OpenSymbol" w:hAnsi="OpenSymbol" w:eastAsia="OpenSymbol" w:cs="OpenSymbol"/>
-    </w:rPr>
-  </w:style>
   <w:style w:type="character" w:styleId="Strong">
     <w:name w:val="Strong"/>
     <w:qFormat/>
     <w:rPr>
       <w:b/>
       <w:bCs/>
+    </w:rPr>
+  </w:style>
+  <w:style w:type="character" w:styleId="Bullets">
+    <w:name w:val="Bullets"/>
+    <w:qFormat/>
+    <w:rPr>
+      <w:rFonts w:ascii="OpenSymbol" w:hAnsi="OpenSymbol" w:eastAsia="OpenSymbol" w:cs="OpenSymbol"/>
     </w:rPr>
   </w:style>
   <w:style w:type="character" w:styleId="Emphasis">

</xml_diff>